<commit_message>
feat(guia-churreria): descargables actualizados tras la revisión adversarial (13)
Via: Claude Code
Co-Authored-By: Claude Opus 5.5 <noreply@anthropic.com>
</commit_message>
<xml_diff>
--- a/astro-site/public/dl/guia-churreria-chocolateria/BONUS-12-decisiones-de-apertura.docx
+++ b/astro-site/public/dl/guia-churreria-chocolateria/BONUS-12-decisiones-de-apertura.docx
@@ -3794,7 +3794,7 @@
                 <w:b w:val="0"/>
                 <w:i w:val="0"/>
               </w:rPr>
-              <w:t>35,0 %</w:t>
+              <w:t>35 %</w:t>
             </w:r>
           </w:p>
         </w:tc>
@@ -3858,7 +3858,7 @@
                 <w:b w:val="0"/>
                 <w:i w:val="0"/>
               </w:rPr>
-              <w:t>35,0 %</w:t>
+              <w:t>35 %</w:t>
             </w:r>
           </w:p>
         </w:tc>
@@ -6167,7 +6167,7 @@
           <w:b w:val="0"/>
           <w:i w:val="0"/>
         </w:rPr>
-        <w:t>Tres ejemplos de lo que se publica, sin recomendar ninguno y sin nombrarlos. Una enseña declara 125.000 € de inversión para un local en bruto con obra, maquinaria y mobiliario, un canon de entrada de 24.040 € y un royalty del 5 % sobre ventas netas, con 39 locales, 32 de ellos en franquicia. Otra declara una inversión inicial desde 115.000 €, un canon de entrada de 15.000 €, un royalty del 5 % y un canon publicitario del 1 %; ojo, es un «desde», no una cifra cerrada. Y una tercera declara 45.000 € de inversión total, 12.000 € de canon de entrada y un royalty del 6 % de la facturación, con contrato de 10 años renovables. Todo ello es declarado por el franquiciador a través de un agregador, sin fecha de dato por marca: orden de magnitud, no precio de contrato (L'Express Franchise, «¿Cómo abrir una churrería en España? TOP 10 marcas de churros», 30-06-2026).</w:t>
+        <w:t>Tres ejemplos de lo que se publica, sin recomendar ninguno. Una enseña declara 125.000 € de inversión para un local en bruto con obra, maquinaria y mobiliario, un canon de entrada de 24.040 € y un royalty del 5 % sobre ventas netas, con 39 locales, 32 de ellos en franquicia. Otra declara una inversión inicial desde 115.000 €, un canon de entrada de 15.000 €, un royalty del 5 % y un canon publicitario del 1 %; ojo, es un «desde», no una cifra cerrada. Y una tercera declara 45.000 € de inversión total, 12.000 € de canon de entrada y un royalty del 6 % de la facturación, con contrato de 10 años renovables. Todo ello es declarado por el franquiciador a través de un agregador, sin fecha de dato por marca: orden de magnitud, no precio de contrato (L'Express Franchise, «¿Cómo abrir una churrería en España? TOP 10 marcas de churros», 30-06-2026).</w:t>
       </w:r>
     </w:p>
     <w:p>

</xml_diff>